<commit_message>
Completed Retail EDA and business insights
</commit_message>
<xml_diff>
--- a/screenshots/02_Retail_EDA_Clean.ipynb_screenshots.docx
+++ b/screenshots/02_Retail_EDA_Clean.ipynb_screenshots.docx
@@ -14,14 +14,7 @@
           <w:b/>
           <w:bCs/>
         </w:rPr>
-        <w:t>02_Retail_EDA_Clean.ipynb</w:t>
-      </w:r>
-      <w:r>
-        <w:rPr>
-          <w:b/>
-          <w:bCs/>
-        </w:rPr>
-        <w:t xml:space="preserve"> screenshots</w:t>
+        <w:t>02_Retail_EDA_Clean.ipynb screenshots</w:t>
       </w:r>
     </w:p>
     <w:p>
@@ -683,6 +676,491 @@
           </wp:inline>
         </w:drawing>
       </w:r>
+    </w:p>
+    <w:p>
+      <w:pPr>
+        <w:rPr>
+          <w:b/>
+          <w:bCs/>
+        </w:rPr>
+      </w:pPr>
+    </w:p>
+    <w:p>
+      <w:pPr>
+        <w:rPr>
+          <w:b/>
+          <w:bCs/>
+        </w:rPr>
+      </w:pPr>
+    </w:p>
+    <w:p>
+      <w:pPr>
+        <w:rPr>
+          <w:b/>
+          <w:bCs/>
+        </w:rPr>
+      </w:pPr>
+    </w:p>
+    <w:p>
+      <w:pPr>
+        <w:rPr>
+          <w:b/>
+          <w:bCs/>
+        </w:rPr>
+      </w:pPr>
+    </w:p>
+    <w:p>
+      <w:pPr>
+        <w:rPr>
+          <w:b/>
+          <w:bCs/>
+        </w:rPr>
+      </w:pPr>
+    </w:p>
+    <w:p>
+      <w:pPr>
+        <w:rPr>
+          <w:b/>
+          <w:bCs/>
+        </w:rPr>
+      </w:pPr>
+      <w:r>
+        <w:rPr>
+          <w:b/>
+          <w:bCs/>
+        </w:rPr>
+        <w:t>Current Status as on 22</w:t>
+      </w:r>
+      <w:r>
+        <w:rPr>
+          <w:b/>
+          <w:bCs/>
+          <w:vertAlign w:val="superscript"/>
+        </w:rPr>
+        <w:t>nd</w:t>
+      </w:r>
+      <w:r>
+        <w:rPr>
+          <w:b/>
+          <w:bCs/>
+        </w:rPr>
+        <w:t xml:space="preserve"> Oct 2026</w:t>
+      </w:r>
+    </w:p>
+    <w:p>
+      <w:pPr>
+        <w:rPr>
+          <w:b/>
+          <w:bCs/>
+        </w:rPr>
+      </w:pPr>
+    </w:p>
+    <w:p>
+      <w:pPr>
+        <w:rPr>
+          <w:b/>
+          <w:bCs/>
+        </w:rPr>
+      </w:pPr>
+      <w:r>
+        <w:rPr>
+          <w:b/>
+          <w:bCs/>
+        </w:rPr>
+        <w:t>Retail Analytics Platform</w:t>
+      </w:r>
+    </w:p>
+    <w:p>
+      <w:pPr>
+        <w:rPr>
+          <w:b/>
+          <w:bCs/>
+        </w:rPr>
+      </w:pPr>
+      <w:r>
+        <w:rPr>
+          <w:b/>
+          <w:bCs/>
+        </w:rPr>
+        <w:t>─────────────────────────</w:t>
+      </w:r>
+    </w:p>
+    <w:p>
+      <w:pPr>
+        <w:rPr>
+          <w:b/>
+          <w:bCs/>
+        </w:rPr>
+      </w:pPr>
+      <w:r>
+        <w:rPr>
+          <w:rFonts w:ascii="Segoe UI Emoji" w:hAnsi="Segoe UI Emoji" w:cs="Segoe UI Emoji"/>
+          <w:b/>
+          <w:bCs/>
+        </w:rPr>
+        <w:t>✅</w:t>
+      </w:r>
+      <w:r>
+        <w:rPr>
+          <w:b/>
+          <w:bCs/>
+        </w:rPr>
+        <w:t xml:space="preserve"> GitHub Repository Setup</w:t>
+      </w:r>
+    </w:p>
+    <w:p>
+      <w:pPr>
+        <w:rPr>
+          <w:b/>
+          <w:bCs/>
+        </w:rPr>
+      </w:pPr>
+      <w:r>
+        <w:rPr>
+          <w:rFonts w:ascii="Segoe UI Emoji" w:hAnsi="Segoe UI Emoji" w:cs="Segoe UI Emoji"/>
+          <w:b/>
+          <w:bCs/>
+        </w:rPr>
+        <w:t>✅</w:t>
+      </w:r>
+      <w:r>
+        <w:rPr>
+          <w:b/>
+          <w:bCs/>
+        </w:rPr>
+        <w:t xml:space="preserve"> VS Code Setup</w:t>
+      </w:r>
+    </w:p>
+    <w:p>
+      <w:pPr>
+        <w:rPr>
+          <w:b/>
+          <w:bCs/>
+        </w:rPr>
+      </w:pPr>
+      <w:r>
+        <w:rPr>
+          <w:rFonts w:ascii="Segoe UI Emoji" w:hAnsi="Segoe UI Emoji" w:cs="Segoe UI Emoji"/>
+          <w:b/>
+          <w:bCs/>
+        </w:rPr>
+        <w:t>✅</w:t>
+      </w:r>
+      <w:r>
+        <w:rPr>
+          <w:b/>
+          <w:bCs/>
+        </w:rPr>
+        <w:t xml:space="preserve"> Git Integration</w:t>
+      </w:r>
+    </w:p>
+    <w:p>
+      <w:pPr>
+        <w:rPr>
+          <w:b/>
+          <w:bCs/>
+        </w:rPr>
+      </w:pPr>
+      <w:r>
+        <w:rPr>
+          <w:rFonts w:ascii="Segoe UI Emoji" w:hAnsi="Segoe UI Emoji" w:cs="Segoe UI Emoji"/>
+          <w:b/>
+          <w:bCs/>
+        </w:rPr>
+        <w:t>✅</w:t>
+      </w:r>
+      <w:r>
+        <w:rPr>
+          <w:b/>
+          <w:bCs/>
+        </w:rPr>
+        <w:t xml:space="preserve"> Python Virtual Environment</w:t>
+      </w:r>
+    </w:p>
+    <w:p>
+      <w:pPr>
+        <w:rPr>
+          <w:b/>
+          <w:bCs/>
+        </w:rPr>
+      </w:pPr>
+      <w:r>
+        <w:rPr>
+          <w:rFonts w:ascii="Segoe UI Emoji" w:hAnsi="Segoe UI Emoji" w:cs="Segoe UI Emoji"/>
+          <w:b/>
+          <w:bCs/>
+        </w:rPr>
+        <w:t>✅</w:t>
+      </w:r>
+      <w:r>
+        <w:rPr>
+          <w:b/>
+          <w:bCs/>
+        </w:rPr>
+        <w:t xml:space="preserve"> Jupyter Notebook Configuration</w:t>
+      </w:r>
+    </w:p>
+    <w:p>
+      <w:pPr>
+        <w:rPr>
+          <w:b/>
+          <w:bCs/>
+        </w:rPr>
+      </w:pPr>
+      <w:r>
+        <w:rPr>
+          <w:rFonts w:ascii="Segoe UI Emoji" w:hAnsi="Segoe UI Emoji" w:cs="Segoe UI Emoji"/>
+          <w:b/>
+          <w:bCs/>
+        </w:rPr>
+        <w:t>✅</w:t>
+      </w:r>
+      <w:r>
+        <w:rPr>
+          <w:b/>
+          <w:bCs/>
+        </w:rPr>
+        <w:t xml:space="preserve"> CSV Dataset Creation</w:t>
+      </w:r>
+    </w:p>
+    <w:p>
+      <w:pPr>
+        <w:rPr>
+          <w:b/>
+          <w:bCs/>
+        </w:rPr>
+      </w:pPr>
+      <w:r>
+        <w:rPr>
+          <w:rFonts w:ascii="Segoe UI Emoji" w:hAnsi="Segoe UI Emoji" w:cs="Segoe UI Emoji"/>
+          <w:b/>
+          <w:bCs/>
+        </w:rPr>
+        <w:t>✅</w:t>
+      </w:r>
+      <w:r>
+        <w:rPr>
+          <w:b/>
+          <w:bCs/>
+        </w:rPr>
+        <w:t xml:space="preserve"> Data Loading</w:t>
+      </w:r>
+    </w:p>
+    <w:p>
+      <w:pPr>
+        <w:rPr>
+          <w:b/>
+          <w:bCs/>
+        </w:rPr>
+      </w:pPr>
+      <w:r>
+        <w:rPr>
+          <w:rFonts w:ascii="Segoe UI Emoji" w:hAnsi="Segoe UI Emoji" w:cs="Segoe UI Emoji"/>
+          <w:b/>
+          <w:bCs/>
+        </w:rPr>
+        <w:lastRenderedPageBreak/>
+        <w:t>✅</w:t>
+      </w:r>
+      <w:r>
+        <w:rPr>
+          <w:b/>
+          <w:bCs/>
+        </w:rPr>
+        <w:t xml:space="preserve"> Data Profiling</w:t>
+      </w:r>
+    </w:p>
+    <w:p>
+      <w:pPr>
+        <w:rPr>
+          <w:b/>
+          <w:bCs/>
+        </w:rPr>
+      </w:pPr>
+      <w:r>
+        <w:rPr>
+          <w:rFonts w:ascii="Segoe UI Emoji" w:hAnsi="Segoe UI Emoji" w:cs="Segoe UI Emoji"/>
+          <w:b/>
+          <w:bCs/>
+        </w:rPr>
+        <w:t>✅</w:t>
+      </w:r>
+      <w:r>
+        <w:rPr>
+          <w:b/>
+          <w:bCs/>
+        </w:rPr>
+        <w:t xml:space="preserve"> Data Quality Checks</w:t>
+      </w:r>
+    </w:p>
+    <w:p>
+      <w:pPr>
+        <w:rPr>
+          <w:b/>
+          <w:bCs/>
+        </w:rPr>
+      </w:pPr>
+      <w:r>
+        <w:rPr>
+          <w:rFonts w:ascii="Segoe UI Emoji" w:hAnsi="Segoe UI Emoji" w:cs="Segoe UI Emoji"/>
+          <w:b/>
+          <w:bCs/>
+        </w:rPr>
+        <w:t>✅</w:t>
+      </w:r>
+      <w:r>
+        <w:rPr>
+          <w:b/>
+          <w:bCs/>
+        </w:rPr>
+        <w:t xml:space="preserve"> KPI Analysis</w:t>
+      </w:r>
+    </w:p>
+    <w:p>
+      <w:pPr>
+        <w:rPr>
+          <w:b/>
+          <w:bCs/>
+        </w:rPr>
+      </w:pPr>
+      <w:r>
+        <w:rPr>
+          <w:rFonts w:ascii="Segoe UI Emoji" w:hAnsi="Segoe UI Emoji" w:cs="Segoe UI Emoji"/>
+          <w:b/>
+          <w:bCs/>
+        </w:rPr>
+        <w:t>✅</w:t>
+      </w:r>
+      <w:r>
+        <w:rPr>
+          <w:b/>
+          <w:bCs/>
+        </w:rPr>
+        <w:t xml:space="preserve"> Store Analysis</w:t>
+      </w:r>
+    </w:p>
+    <w:p>
+      <w:pPr>
+        <w:rPr>
+          <w:b/>
+          <w:bCs/>
+        </w:rPr>
+      </w:pPr>
+      <w:r>
+        <w:rPr>
+          <w:rFonts w:ascii="Segoe UI Emoji" w:hAnsi="Segoe UI Emoji" w:cs="Segoe UI Emoji"/>
+          <w:b/>
+          <w:bCs/>
+        </w:rPr>
+        <w:t>✅</w:t>
+      </w:r>
+      <w:r>
+        <w:rPr>
+          <w:b/>
+          <w:bCs/>
+        </w:rPr>
+        <w:t xml:space="preserve"> Category Analysis</w:t>
+      </w:r>
+    </w:p>
+    <w:p>
+      <w:pPr>
+        <w:rPr>
+          <w:b/>
+          <w:bCs/>
+        </w:rPr>
+      </w:pPr>
+      <w:r>
+        <w:rPr>
+          <w:rFonts w:ascii="Segoe UI Emoji" w:hAnsi="Segoe UI Emoji" w:cs="Segoe UI Emoji"/>
+          <w:b/>
+          <w:bCs/>
+        </w:rPr>
+        <w:t>✅</w:t>
+      </w:r>
+      <w:r>
+        <w:rPr>
+          <w:b/>
+          <w:bCs/>
+        </w:rPr>
+        <w:t xml:space="preserve"> Product Analysis</w:t>
+      </w:r>
+    </w:p>
+    <w:p>
+      <w:pPr>
+        <w:rPr>
+          <w:b/>
+          <w:bCs/>
+        </w:rPr>
+      </w:pPr>
+      <w:r>
+        <w:rPr>
+          <w:rFonts w:ascii="Segoe UI Emoji" w:hAnsi="Segoe UI Emoji" w:cs="Segoe UI Emoji"/>
+          <w:b/>
+          <w:bCs/>
+        </w:rPr>
+        <w:t>✅</w:t>
+      </w:r>
+      <w:r>
+        <w:rPr>
+          <w:b/>
+          <w:bCs/>
+        </w:rPr>
+        <w:t xml:space="preserve"> Visualizations</w:t>
+      </w:r>
+    </w:p>
+    <w:p>
+      <w:pPr>
+        <w:rPr>
+          <w:b/>
+          <w:bCs/>
+        </w:rPr>
+      </w:pPr>
+      <w:r>
+        <w:rPr>
+          <w:rFonts w:ascii="Segoe UI Emoji" w:hAnsi="Segoe UI Emoji" w:cs="Segoe UI Emoji"/>
+          <w:b/>
+          <w:bCs/>
+        </w:rPr>
+        <w:t>✅</w:t>
+      </w:r>
+      <w:r>
+        <w:rPr>
+          <w:b/>
+          <w:bCs/>
+        </w:rPr>
+        <w:t xml:space="preserve"> Screenshot Documentation</w:t>
+      </w:r>
+    </w:p>
+    <w:p>
+      <w:pPr>
+        <w:rPr>
+          <w:b/>
+          <w:bCs/>
+        </w:rPr>
+      </w:pPr>
+      <w:r>
+        <w:rPr>
+          <w:rFonts w:ascii="Segoe UI Emoji" w:hAnsi="Segoe UI Emoji" w:cs="Segoe UI Emoji"/>
+          <w:b/>
+          <w:bCs/>
+        </w:rPr>
+        <w:t>✅</w:t>
+      </w:r>
+      <w:r>
+        <w:rPr>
+          <w:b/>
+          <w:bCs/>
+        </w:rPr>
+        <w:t xml:space="preserve"> Clean Notebook (02_Retail_EDA_Clean.ipynb)</w:t>
+      </w:r>
+    </w:p>
+    <w:p>
+      <w:pPr>
+        <w:rPr>
+          <w:b/>
+          <w:bCs/>
+        </w:rPr>
+      </w:pPr>
     </w:p>
     <w:sectPr>
       <w:pgSz w:w="12240" w:h="15840"/>
@@ -1297,7 +1775,6 @@
   <w:style w:type="character" w:default="1" w:styleId="DefaultParagraphFont">
     <w:name w:val="Default Paragraph Font"/>
     <w:uiPriority w:val="1"/>
-    <w:semiHidden/>
     <w:unhideWhenUsed/>
   </w:style>
   <w:style w:type="table" w:default="1" w:styleId="TableNormal">

</xml_diff>